<commit_message>
synchronized skills on resume.
</commit_message>
<xml_diff>
--- a/src/assets/resume/MVillalobosWorkHistory.docx
+++ b/src/assets/resume/MVillalobosWorkHistory.docx
@@ -1653,22 +1653,127 @@
               <w:t xml:space="preserve">, </w:t>
             </w:r>
             <w:r>
-              <w:t xml:space="preserve">Servlet, JSP, JSF, JAX-RS, </w:t>
+              <w:t>Servlet, JSP, JSF, JAX-RS, JAX-WS, REST, SOAP, O</w:t>
+            </w:r>
+            <w:r>
+              <w:t>A</w:t>
+            </w:r>
+            <w:r>
+              <w:t>uth 2, JSON</w:t>
+            </w:r>
+            <w:r>
+              <w:t xml:space="preserve"> </w:t>
             </w:r>
             <w:r>
               <w:t xml:space="preserve">and </w:t>
             </w:r>
             <w:r>
-              <w:t>JAX-WS, REST, SOAP, Oauth 2, JSON</w:t>
+              <w:t>JAAS</w:t>
+            </w:r>
+            <w:r>
+              <w:t>.</w:t>
+            </w:r>
+          </w:p>
+          <w:p>
+            <w:pPr>
+              <w:pStyle w:val="Skills"/>
+              <w:snapToGrid w:val="0"/>
+            </w:pPr>
+          </w:p>
+          <w:p>
+            <w:pPr>
+              <w:pStyle w:val="Skills"/>
+              <w:snapToGrid w:val="0"/>
+            </w:pPr>
+            <w:r>
+              <w:t xml:space="preserve">Apache Flink, Apache Flink Stateful Function, Stream Programming, </w:t>
+            </w:r>
+            <w:r>
+              <w:t xml:space="preserve">Data Architecture, </w:t>
+            </w:r>
+            <w:r>
+              <w:t xml:space="preserve">Kappa Architecture, </w:t>
+            </w:r>
+            <w:r>
+              <w:t xml:space="preserve">Lakehouse Architecture, </w:t>
+            </w:r>
+            <w:r>
+              <w:t xml:space="preserve">Parquet, </w:t>
+            </w:r>
+            <w:r>
+              <w:t xml:space="preserve">Apache Paimon, Apache Iceberg, Apache Spark, Apache Flink CDC, </w:t>
+            </w:r>
+            <w:r>
+              <w:t xml:space="preserve">Flink Kubernetes Operator, Apache Kafka, Strimzi Kafka Operator, and </w:t>
+            </w:r>
+            <w:r>
+              <w:t>Debezium.</w:t>
+            </w:r>
+          </w:p>
+          <w:p>
+            <w:pPr>
+              <w:pStyle w:val="Skills"/>
+              <w:snapToGrid w:val="0"/>
+            </w:pPr>
+          </w:p>
+          <w:p>
+            <w:pPr>
+              <w:pStyle w:val="Skills"/>
+              <w:snapToGrid w:val="0"/>
+            </w:pPr>
+            <w:r>
+              <w:t xml:space="preserve">AI, </w:t>
+            </w:r>
+            <w:r>
+              <w:t xml:space="preserve">LLM, </w:t>
+            </w:r>
+            <w:r>
+              <w:t>Context Engineering, Cursor,</w:t>
+            </w:r>
+            <w:r>
+              <w:t xml:space="preserve"> Claude Code,</w:t>
             </w:r>
             <w:r>
               <w:t xml:space="preserve"> </w:t>
             </w:r>
             <w:r>
+              <w:t>Cline, GitHub</w:t>
+            </w:r>
+            <w:r>
+              <w:t xml:space="preserve"> Co-Pilot, </w:t>
+            </w:r>
+            <w:r>
+              <w:t xml:space="preserve">Skills, </w:t>
+            </w:r>
+            <w:r>
+              <w:t>MCP Server</w:t>
+            </w:r>
+            <w:r>
+              <w:t>, Ollama, Hugging Face, and Web UI</w:t>
+            </w:r>
+            <w:r>
+              <w:t>.</w:t>
+            </w:r>
+          </w:p>
+          <w:p>
+            <w:pPr>
+              <w:pStyle w:val="Skills"/>
+              <w:snapToGrid w:val="0"/>
+            </w:pPr>
+          </w:p>
+          <w:p>
+            <w:pPr>
+              <w:pStyle w:val="Skills"/>
+              <w:snapToGrid w:val="0"/>
+            </w:pPr>
+            <w:r>
+              <w:t xml:space="preserve">The Spring Framework, Spring Boot, Spring MVC, Spring Security, Inversion of Control, Dependency Injection, </w:t>
+            </w:r>
+            <w:r>
               <w:t xml:space="preserve">and </w:t>
             </w:r>
             <w:r>
-              <w:t>JAAS</w:t>
+              <w:t>AOP</w:t>
             </w:r>
             <w:r>
               <w:t>.</w:t>
@@ -1686,10 +1791,7 @@
               <w:snapToGrid w:val="0"/>
             </w:pPr>
             <w:r>
-              <w:t>Apache Flink, Apache Flink Stateful Function, Stream Programming, Kappa Architecture, Parquet, Influx Db</w:t>
-            </w:r>
-            <w:r>
-              <w:t>, Apache Paimon, Apache Iceberg, Apache Spark, Apache Flink CDC, Debezium.</w:t>
+              <w:t>Network Programming, Socket Programming, NIO, Netty, and Protocol Buffers.</w:t>
             </w:r>
           </w:p>
           <w:p>
@@ -1704,13 +1806,16 @@
               <w:snapToGrid w:val="0"/>
             </w:pPr>
             <w:r>
-              <w:t xml:space="preserve">AI, Context Engineering, Cursor, Github Co-Pilot, </w:t>
-            </w:r>
-            <w:r>
-              <w:t xml:space="preserve">Skills, </w:t>
-            </w:r>
-            <w:r>
-              <w:t>MCP Servers.</w:t>
+              <w:t xml:space="preserve">SQL, </w:t>
+            </w:r>
+            <w:r>
+              <w:t>RDBMS, PostgreSQL, Oracle, DB2, Microsoft SQL Server, MySql, SQLite, H2</w:t>
+            </w:r>
+            <w:r>
+              <w:t>, Liquibase, Flyway, ACID, Normalization, Third Normal Form (3NF)</w:t>
+            </w:r>
+            <w:r>
+              <w:t>.</w:t>
             </w:r>
           </w:p>
           <w:p>
@@ -1725,13 +1830,19 @@
               <w:snapToGrid w:val="0"/>
             </w:pPr>
             <w:r>
-              <w:t xml:space="preserve">The Spring Framework, Spring Boot, Spring MVC, Spring Security, Inversion of Control, Dependency Injection, </w:t>
+              <w:t xml:space="preserve">NoSQL, </w:t>
+            </w:r>
+            <w:r>
+              <w:t xml:space="preserve">Mongo DB Atlas, Influx DB, Elastic Search, Lucene, </w:t>
+            </w:r>
+            <w:r>
+              <w:t xml:space="preserve">Phoenix, HBase, Cassandra, DynamoDB, Hadoop, </w:t>
             </w:r>
             <w:r>
               <w:t xml:space="preserve">and </w:t>
             </w:r>
             <w:r>
-              <w:t>AOP</w:t>
+              <w:t>Map Reduce</w:t>
             </w:r>
             <w:r>
               <w:t>.</w:t>
@@ -1749,7 +1860,34 @@
               <w:snapToGrid w:val="0"/>
             </w:pPr>
             <w:r>
-              <w:t>Network Programming, Socket Programming, NIO, Netty, and Protocol Buffers.</w:t>
+              <w:t xml:space="preserve">Concurrency </w:t>
+            </w:r>
+            <w:r>
+              <w:t>p</w:t>
+            </w:r>
+            <w:r>
+              <w:t xml:space="preserve">rogramming, </w:t>
+            </w:r>
+            <w:r>
+              <w:t xml:space="preserve">Multi-threaded programming, </w:t>
+            </w:r>
+            <w:r>
+              <w:t>Thread-</w:t>
+            </w:r>
+            <w:r>
+              <w:t>s</w:t>
+            </w:r>
+            <w:r>
+              <w:t xml:space="preserve">afety, </w:t>
+            </w:r>
+            <w:r>
+              <w:t xml:space="preserve">and </w:t>
+            </w:r>
+            <w:r>
+              <w:t>Java Util Concurrent</w:t>
+            </w:r>
+            <w:r>
+              <w:t>.</w:t>
             </w:r>
           </w:p>
           <w:p>
@@ -1764,13 +1902,136 @@
               <w:snapToGrid w:val="0"/>
             </w:pPr>
             <w:r>
-              <w:t xml:space="preserve">RDBMS, PostgreSQL, Oracle, DB2, Microsoft SQL Server, MySql, SQLite, H2, </w:t>
+              <w:t xml:space="preserve">Kubernetes, </w:t>
+            </w:r>
+            <w:r>
+              <w:t xml:space="preserve">MiniKube, </w:t>
+            </w:r>
+            <w:r>
+              <w:t xml:space="preserve">Containers, </w:t>
+            </w:r>
+            <w:r>
+              <w:t>Docker, Docker Compose</w:t>
+            </w:r>
+            <w:r>
+              <w:t>, and Terraform</w:t>
+            </w:r>
+            <w:r>
+              <w:t>.</w:t>
+            </w:r>
+          </w:p>
+          <w:p>
+            <w:pPr>
+              <w:pStyle w:val="Skills"/>
+              <w:snapToGrid w:val="0"/>
+            </w:pPr>
+          </w:p>
+          <w:p>
+            <w:pPr>
+              <w:pStyle w:val="Skills"/>
+              <w:snapToGrid w:val="0"/>
+            </w:pPr>
+            <w:r>
+              <w:t xml:space="preserve">AWS, </w:t>
+            </w:r>
+            <w:r>
+              <w:t>Cloud Computing, Distributed Computing, EC2</w:t>
+            </w:r>
+            <w:r>
+              <w:t>, ECS, EKS</w:t>
+            </w:r>
+            <w:r>
+              <w:t>, EMR</w:t>
+            </w:r>
+            <w:r>
+              <w:t>, and LocalStack</w:t>
+            </w:r>
+            <w:r>
+              <w:t>.</w:t>
+            </w:r>
+          </w:p>
+          <w:p>
+            <w:pPr>
+              <w:pStyle w:val="Skills"/>
+              <w:snapToGrid w:val="0"/>
+            </w:pPr>
+          </w:p>
+          <w:p>
+            <w:pPr>
+              <w:pStyle w:val="Skills"/>
+              <w:snapToGrid w:val="0"/>
+            </w:pPr>
+            <w:r>
+              <w:t xml:space="preserve">Python, Flask, SQL Alchemy, Authlib, </w:t>
+            </w:r>
+            <w:r>
+              <w:t xml:space="preserve">UV, </w:t>
+            </w:r>
+            <w:r>
+              <w:t xml:space="preserve">PyEnv, </w:t>
             </w:r>
             <w:r>
               <w:t xml:space="preserve">and </w:t>
             </w:r>
             <w:r>
-              <w:t>SQL</w:t>
+              <w:t>Virtual Env.</w:t>
+            </w:r>
+          </w:p>
+          <w:p>
+            <w:pPr>
+              <w:pStyle w:val="Skills"/>
+              <w:snapToGrid w:val="0"/>
+            </w:pPr>
+          </w:p>
+          <w:p>
+            <w:pPr>
+              <w:pStyle w:val="Skills"/>
+              <w:snapToGrid w:val="0"/>
+            </w:pPr>
+            <w:r>
+              <w:t>Ruby, JRuby, and Ruby on Rails.</w:t>
+            </w:r>
+          </w:p>
+          <w:p>
+            <w:pPr>
+              <w:pStyle w:val="Skills"/>
+              <w:snapToGrid w:val="0"/>
+            </w:pPr>
+          </w:p>
+          <w:p>
+            <w:pPr>
+              <w:pStyle w:val="Skills"/>
+              <w:snapToGrid w:val="0"/>
+            </w:pPr>
+            <w:r>
+              <w:t xml:space="preserve">Angular, NextJS, </w:t>
+            </w:r>
+            <w:r>
+              <w:t xml:space="preserve">React, </w:t>
+            </w:r>
+            <w:r>
+              <w:t>TypeScript</w:t>
+            </w:r>
+            <w:r>
+              <w:t xml:space="preserve">, </w:t>
+            </w:r>
+            <w:r>
+              <w:t>JavaScript, ECMAScript, JQuery</w:t>
+            </w:r>
+            <w:r>
+              <w:t xml:space="preserve">, </w:t>
+            </w:r>
+            <w:r>
+              <w:t xml:space="preserve">Tailwind, </w:t>
+            </w:r>
+            <w:r>
+              <w:t>CSS,</w:t>
+            </w:r>
+            <w:r>
+              <w:t xml:space="preserve"> and</w:t>
+            </w:r>
+            <w:r>
+              <w:t xml:space="preserve"> Bootstrap</w:t>
             </w:r>
             <w:r>
               <w:t>.</w:t>
@@ -1788,16 +2049,7 @@
               <w:snapToGrid w:val="0"/>
             </w:pPr>
             <w:r>
-              <w:t xml:space="preserve">NoSQL, Phoenix, HBase, Cassandra, DynamoDB, Hadoop, Map Reduce, </w:t>
-            </w:r>
-            <w:r>
-              <w:t xml:space="preserve">and </w:t>
-            </w:r>
-            <w:r>
-              <w:t>Lucene</w:t>
-            </w:r>
-            <w:r>
-              <w:t>.</w:t>
+              <w:t>Linux, Open LDAP, Bash, Awk, and sometimes PERL.</w:t>
             </w:r>
           </w:p>
           <w:p>
@@ -1812,16 +2064,13 @@
               <w:snapToGrid w:val="0"/>
             </w:pPr>
             <w:r>
-              <w:t xml:space="preserve">Concurrency Programming, Thread-Safety, </w:t>
-            </w:r>
-            <w:r>
-              <w:t xml:space="preserve">and </w:t>
-            </w:r>
-            <w:r>
-              <w:t>Java Util Concurrent</w:t>
-            </w:r>
-            <w:r>
-              <w:t>.</w:t>
+              <w:t>Version Control, Git, GitHub, GitHub Actions, GitLab, Bit</w:t>
+            </w:r>
+            <w:r>
+              <w:t>b</w:t>
+            </w:r>
+            <w:r>
+              <w:t>ucket, Subversion, and CVS.</w:t>
             </w:r>
           </w:p>
           <w:p>
@@ -1836,169 +2085,13 @@
               <w:snapToGrid w:val="0"/>
             </w:pPr>
             <w:r>
-              <w:t xml:space="preserve">Kubernetes, Containers, </w:t>
-            </w:r>
-            <w:r>
-              <w:t>Docker, and Docker Compose.</w:t>
-            </w:r>
-          </w:p>
-          <w:p>
-            <w:pPr>
-              <w:pStyle w:val="Skills"/>
-              <w:snapToGrid w:val="0"/>
-            </w:pPr>
-          </w:p>
-          <w:p>
-            <w:pPr>
-              <w:pStyle w:val="Skills"/>
-              <w:snapToGrid w:val="0"/>
-            </w:pPr>
-            <w:r>
-              <w:t>Flink, Data-Architecture, and Streaming.</w:t>
-            </w:r>
-          </w:p>
-          <w:p>
-            <w:pPr>
-              <w:pStyle w:val="Skills"/>
-              <w:snapToGrid w:val="0"/>
-            </w:pPr>
-          </w:p>
-          <w:p>
-            <w:pPr>
-              <w:pStyle w:val="Skills"/>
-              <w:snapToGrid w:val="0"/>
-            </w:pPr>
-            <w:r>
-              <w:t xml:space="preserve">AWS, </w:t>
-            </w:r>
-            <w:r>
-              <w:t>Cloud Computing, Distributed Computing, EC2</w:t>
-            </w:r>
-            <w:r>
-              <w:t>, and EMR</w:t>
-            </w:r>
-            <w:r>
-              <w:t>.</w:t>
-            </w:r>
-          </w:p>
-          <w:p>
-            <w:pPr>
-              <w:pStyle w:val="Skills"/>
-              <w:snapToGrid w:val="0"/>
-            </w:pPr>
-          </w:p>
-          <w:p>
-            <w:pPr>
-              <w:pStyle w:val="Skills"/>
-              <w:snapToGrid w:val="0"/>
-            </w:pPr>
-            <w:r>
-              <w:t xml:space="preserve">Python, Flask, SQL Alchemy, Authlib, PyEnv, </w:t>
-            </w:r>
-            <w:r>
-              <w:t xml:space="preserve">and </w:t>
-            </w:r>
-            <w:r>
-              <w:t>Virtual Env.</w:t>
-            </w:r>
-          </w:p>
-          <w:p>
-            <w:pPr>
-              <w:pStyle w:val="Skills"/>
-              <w:snapToGrid w:val="0"/>
-            </w:pPr>
-          </w:p>
-          <w:p>
-            <w:pPr>
-              <w:pStyle w:val="Skills"/>
-              <w:snapToGrid w:val="0"/>
-            </w:pPr>
-            <w:r>
-              <w:t>Ruby, JRuby, and Ruby on Rails.</w:t>
-            </w:r>
-          </w:p>
-          <w:p>
-            <w:pPr>
-              <w:pStyle w:val="Skills"/>
-              <w:snapToGrid w:val="0"/>
-            </w:pPr>
-          </w:p>
-          <w:p>
-            <w:pPr>
-              <w:pStyle w:val="Skills"/>
-              <w:snapToGrid w:val="0"/>
-            </w:pPr>
-            <w:r>
-              <w:t xml:space="preserve">Angular, NextJS, </w:t>
-            </w:r>
-            <w:r>
-              <w:t>TypeScript</w:t>
-            </w:r>
-            <w:r>
-              <w:t xml:space="preserve">, </w:t>
-            </w:r>
-            <w:r>
-              <w:t>JavaScript, ECMAScript, JQuery</w:t>
-            </w:r>
-            <w:r>
-              <w:t xml:space="preserve">, </w:t>
-            </w:r>
-            <w:r>
-              <w:t>CSS,</w:t>
-            </w:r>
-            <w:r>
-              <w:t xml:space="preserve"> and</w:t>
-            </w:r>
-            <w:r>
-              <w:t xml:space="preserve"> Bootstrap</w:t>
-            </w:r>
-            <w:r>
-              <w:t>.</w:t>
-            </w:r>
-          </w:p>
-          <w:p>
-            <w:pPr>
-              <w:pStyle w:val="Skills"/>
-              <w:snapToGrid w:val="0"/>
-            </w:pPr>
-          </w:p>
-          <w:p>
-            <w:pPr>
-              <w:pStyle w:val="Skills"/>
-              <w:snapToGrid w:val="0"/>
-            </w:pPr>
-            <w:r>
-              <w:t>Linux, Open LDAP, Bash, Awk, and sometimes PERL.</w:t>
-            </w:r>
-          </w:p>
-          <w:p>
-            <w:pPr>
-              <w:pStyle w:val="Skills"/>
-              <w:snapToGrid w:val="0"/>
-            </w:pPr>
-          </w:p>
-          <w:p>
-            <w:pPr>
-              <w:pStyle w:val="Skills"/>
-              <w:snapToGrid w:val="0"/>
-            </w:pPr>
-            <w:r>
-              <w:t>Version Control, Git, Subversion, and CVS.</w:t>
-            </w:r>
-          </w:p>
-          <w:p>
-            <w:pPr>
-              <w:pStyle w:val="Skills"/>
-              <w:snapToGrid w:val="0"/>
-            </w:pPr>
-          </w:p>
-          <w:p>
-            <w:pPr>
-              <w:pStyle w:val="Skills"/>
-              <w:snapToGrid w:val="0"/>
-            </w:pPr>
-            <w:r>
-              <w:t xml:space="preserve">Package Management, Maven, Gradle, NPM, </w:t>
+              <w:t>Package Management, Maven, Gradle,</w:t>
+            </w:r>
+            <w:r>
+              <w:t xml:space="preserve"> PIP,</w:t>
+            </w:r>
+            <w:r>
+              <w:t xml:space="preserve"> NPM, </w:t>
             </w:r>
             <w:r>
               <w:t xml:space="preserve">and </w:t>
@@ -2078,6 +2171,7 @@
               <w:snapToGrid w:val="0"/>
             </w:pPr>
             <w:r>
+              <w:lastRenderedPageBreak/>
               <w:t>Affiliations</w:t>
             </w:r>
           </w:p>
@@ -2183,7 +2277,6 @@
               <w:snapToGrid w:val="0"/>
             </w:pPr>
             <w:r>
-              <w:lastRenderedPageBreak/>
               <w:t>Presentations</w:t>
             </w:r>
           </w:p>
@@ -2587,7 +2680,7 @@
                       </a:ln>
                       <a:extLst>
                         <a:ext uri="{91240B29-F687-4f45-9708-019B960494DF}">
-                          <a14:hiddenLine xmlns="" xmlns:mo="http://schemas.microsoft.com/office/mac/office/2008/main" xmlns:mv="urn:schemas-microsoft-com:mac:vml" xmlns:o="urn:schemas-microsoft-com:office:office" xmlns:v="urn:schemas-microsoft-com:vml" xmlns:w10="urn:schemas-microsoft-com:office:word" xmlns:w="http://schemas.openxmlformats.org/wordprocessingml/2006/main" xmlns:a14="http://schemas.microsoft.com/office/drawing/2010/main" w="9525">
+                          <a14:hiddenLine xmlns:a14="http://schemas.microsoft.com/office/drawing/2010/main" xmlns:w="http://schemas.openxmlformats.org/wordprocessingml/2006/main" xmlns:w10="urn:schemas-microsoft-com:office:word" xmlns:v="urn:schemas-microsoft-com:vml" xmlns:o="urn:schemas-microsoft-com:office:office" xmlns:mv="urn:schemas-microsoft-com:mac:vml" xmlns:mo="http://schemas.microsoft.com/office/mac/office/2008/main" xmlns="" w="9525">
                             <a:solidFill>
                               <a:srgbClr val="000000"/>
                             </a:solidFill>
@@ -5201,6 +5294,7 @@
   <w:style w:type="character" w:default="1" w:styleId="DefaultParagraphFont">
     <w:name w:val="Default Paragraph Font"/>
     <w:uiPriority w:val="1"/>
+    <w:semiHidden/>
     <w:unhideWhenUsed/>
   </w:style>
   <w:style w:type="table" w:default="1" w:styleId="TableNormal">

</xml_diff>